<commit_message>
Mise à jour Livrables Projet 2
</commit_message>
<xml_diff>
--- a/openclassroomsProject/Projet3/Docs/P3-EDO-P4-AL-Documentation-technique DATASHARE_v3.docx
+++ b/openclassroomsProject/Projet3/Docs/P3-EDO-P4-AL-Documentation-technique DATASHARE_v3.docx
@@ -26,6 +26,7 @@
         <w:rPr>
           <w:b/>
           <w:bCs/>
+          <w:noProof/>
         </w:rPr>
         <w:drawing>
           <wp:inline distT="0" distB="0" distL="0" distR="0" wp14:anchorId="05002633" wp14:editId="148B986E">
@@ -1610,7 +1611,18 @@
             <w:noProof/>
             <w:lang w:eastAsia="fr-FR"/>
           </w:rPr>
-          <w:t>PostgreSQL 15</w:t>
+          <w:t xml:space="preserve">PostgreSQL </w:t>
+        </w:r>
+        <w:r>
+          <w:rPr>
+            <w:rStyle w:val="Lienhypertexte"/>
+            <w:rFonts w:ascii="Times New Roman" w:eastAsia="Times New Roman" w:hAnsi="Times New Roman" w:cs="Times New Roman"/>
+            <w:b/>
+            <w:bCs/>
+            <w:noProof/>
+            <w:lang w:eastAsia="fr-FR"/>
+          </w:rPr>
+          <w:t>18.4.2</w:t>
         </w:r>
         <w:r>
           <w:rPr>
@@ -10777,9 +10789,31 @@
           <w:szCs w:val="27"/>
           <w:lang w:eastAsia="fr-FR" w:bidi="ar-SA"/>
         </w:rPr>
-        <w:t>PostgreSQL 15</w:t>
+        <w:t xml:space="preserve">PostgreSQL </w:t>
       </w:r>
       <w:bookmarkEnd w:id="20"/>
+      <w:r>
+        <w:rPr>
+          <w:rFonts w:ascii="Times New Roman" w:eastAsia="Times New Roman" w:hAnsi="Times New Roman" w:cs="Times New Roman"/>
+          <w:b/>
+          <w:bCs/>
+          <w:sz w:val="27"/>
+          <w:szCs w:val="27"/>
+          <w:lang w:eastAsia="fr-FR" w:bidi="ar-SA"/>
+        </w:rPr>
+        <w:t>18.4</w:t>
+      </w:r>
+      <w:r>
+        <w:rPr>
+          <w:rFonts w:ascii="Times New Roman" w:eastAsia="Times New Roman" w:hAnsi="Times New Roman" w:cs="Times New Roman"/>
+          <w:b/>
+          <w:bCs/>
+          <w:sz w:val="27"/>
+          <w:szCs w:val="27"/>
+          <w:lang w:eastAsia="fr-FR" w:bidi="ar-SA"/>
+        </w:rPr>
+        <w:t>.2</w:t>
+      </w:r>
     </w:p>
     <w:p>
       <w:pPr>
@@ -17560,7 +17594,16 @@
           <w:szCs w:val="24"/>
           <w:lang w:eastAsia="fr-FR" w:bidi="ar-SA"/>
         </w:rPr>
-        <w:t>PostgreSQL 15</w:t>
+        <w:t xml:space="preserve">PostgreSQL </w:t>
+      </w:r>
+      <w:r>
+        <w:rPr>
+          <w:rFonts w:ascii="Times New Roman" w:eastAsia="Times New Roman" w:hAnsi="Times New Roman" w:cs="Times New Roman"/>
+          <w:sz w:val="24"/>
+          <w:szCs w:val="24"/>
+          <w:lang w:eastAsia="fr-FR" w:bidi="ar-SA"/>
+        </w:rPr>
+        <w:t>18.4.2</w:t>
       </w:r>
     </w:p>
     <w:p>
@@ -25937,6 +25980,7 @@
   <w:style w:type="character" w:default="1" w:styleId="Policepardfaut">
     <w:name w:val="Default Paragraph Font"/>
     <w:uiPriority w:val="1"/>
+    <w:semiHidden/>
     <w:unhideWhenUsed/>
   </w:style>
   <w:style w:type="table" w:default="1" w:styleId="TableauNormal">
@@ -26853,7 +26897,10 @@
   </w:compat>
   <w:rsids>
     <w:rsidRoot w:val="00F41C1C"/>
+    <w:rsid w:val="004731D9"/>
     <w:rsid w:val="009C5A9D"/>
+    <w:rsid w:val="00BF30E5"/>
+    <w:rsid w:val="00EF5476"/>
     <w:rsid w:val="00F0513A"/>
     <w:rsid w:val="00F41C1C"/>
   </w:rsids>

</xml_diff>